<commit_message>
feat: alineacion exhaustiva a rubrica APF1 - Canvas BMC, 3 alternativas Java y guia maestra de sustentacion oral
</commit_message>
<xml_diff>
--- a/01_DOCUMENTACION_TECNICA/INFORME_ACADEMICO_APF1_COMPLETO.docx
+++ b/01_DOCUMENTACION_TECNICA/INFORME_ACADEMICO_APF1_COMPLETO.docx
@@ -511,6 +511,16 @@
     </w:p>
     <w:p>
       <w:pPr>
+        <w:ind w:left="360"/>
+      </w:pPr>
+      <w:r>
+        <w:t>1.5. Análisis del Entorno, Estrategias, Planes y Canvas BMC</w:t>
+        <w:tab/>
+        <w:t>6</w:t>
+      </w:r>
+    </w:p>
+    <w:p>
+      <w:pPr>
         <w:pStyle w:val="TDC2"/>
         <w:tabs>
           <w:tab w:val="right" w:leader="dot" w:pos="9350"/>
@@ -881,6 +891,16 @@
     </w:p>
     <w:p>
       <w:pPr>
+        <w:ind w:left="360"/>
+      </w:pPr>
+      <w:r>
+        <w:t>2.5. Planteamiento y Evaluación de Alternativas de Solución</w:t>
+        <w:tab/>
+        <w:t>7</w:t>
+      </w:r>
+    </w:p>
+    <w:p>
+      <w:pPr>
         <w:pStyle w:val="TDC2"/>
         <w:tabs>
           <w:tab w:val="right" w:leader="dot" w:pos="9350"/>
@@ -1029,6 +1049,16 @@
     </w:p>
     <w:p>
       <w:pPr>
+        <w:ind w:left="360"/>
+      </w:pPr>
+      <w:r>
+        <w:t>3.1. Project Charter Básico (Acta de Constitución)</w:t>
+        <w:tab/>
+        <w:t>8</w:t>
+      </w:r>
+    </w:p>
+    <w:p>
+      <w:pPr>
         <w:pStyle w:val="TDC2"/>
         <w:tabs>
           <w:tab w:val="right" w:leader="dot" w:pos="9350"/>
@@ -1042,64 +1072,11 @@
           <w14:ligatures w14:val="standardContextual"/>
         </w:rPr>
       </w:pPr>
-      <w:hyperlink w:anchor="_Toc239448678" w:history="1">
-        <w:r>
-          <w:rPr>
-            <w:rStyle w:val="Hipervnculo"/>
-            <w:rFonts w:ascii="Arial" w:hAnsi="Arial"/>
-            <w:noProof/>
-          </w:rPr>
-          <w:t>3.1. Marco Metodológico Ágil Adaptado a Entornos Regulados</w:t>
-        </w:r>
-        <w:r>
-          <w:rPr>
-            <w:noProof/>
-            <w:webHidden/>
-          </w:rPr>
-          <w:tab/>
-        </w:r>
-        <w:r>
-          <w:rPr>
-            <w:noProof/>
-            <w:webHidden/>
-          </w:rPr>
-          <w:fldChar w:fldCharType="begin"/>
-        </w:r>
-        <w:r>
-          <w:rPr>
-            <w:noProof/>
-            <w:webHidden/>
-          </w:rPr>
-          <w:instrText xml:space="preserve"> PAGEREF _Toc239448678 \h </w:instrText>
-        </w:r>
-        <w:r>
-          <w:rPr>
-            <w:noProof/>
-            <w:webHidden/>
-          </w:rPr>
-        </w:r>
-        <w:r>
-          <w:rPr>
-            <w:noProof/>
-            <w:webHidden/>
-          </w:rPr>
-          <w:fldChar w:fldCharType="separate"/>
-        </w:r>
-        <w:r>
-          <w:rPr>
-            <w:noProof/>
-            <w:webHidden/>
-          </w:rPr>
-          <w:t>8</w:t>
-        </w:r>
-        <w:r>
-          <w:rPr>
-            <w:noProof/>
-            <w:webHidden/>
-          </w:rPr>
-          <w:fldChar w:fldCharType="end"/>
-        </w:r>
-      </w:hyperlink>
+      <w:r>
+        <w:t>3.2. Marco Metodológico Ágil Adaptado a Entornos Regulados</w:t>
+        <w:tab/>
+        <w:t>8</w:t>
+      </w:r>
     </w:p>
     <w:p>
       <w:pPr>
@@ -1116,64 +1093,11 @@
           <w14:ligatures w14:val="standardContextual"/>
         </w:rPr>
       </w:pPr>
-      <w:hyperlink w:anchor="_Toc239448679" w:history="1">
-        <w:r>
-          <w:rPr>
-            <w:rStyle w:val="Hipervnculo"/>
-            <w:rFonts w:ascii="Arial" w:hAnsi="Arial"/>
-            <w:noProof/>
-          </w:rPr>
-          <w:t>3.2. Estructura de Desglose del Trabajo (EDT / WBS)</w:t>
-        </w:r>
-        <w:r>
-          <w:rPr>
-            <w:noProof/>
-            <w:webHidden/>
-          </w:rPr>
-          <w:tab/>
-        </w:r>
-        <w:r>
-          <w:rPr>
-            <w:noProof/>
-            <w:webHidden/>
-          </w:rPr>
-          <w:fldChar w:fldCharType="begin"/>
-        </w:r>
-        <w:r>
-          <w:rPr>
-            <w:noProof/>
-            <w:webHidden/>
-          </w:rPr>
-          <w:instrText xml:space="preserve"> PAGEREF _Toc239448679 \h </w:instrText>
-        </w:r>
-        <w:r>
-          <w:rPr>
-            <w:noProof/>
-            <w:webHidden/>
-          </w:rPr>
-        </w:r>
-        <w:r>
-          <w:rPr>
-            <w:noProof/>
-            <w:webHidden/>
-          </w:rPr>
-          <w:fldChar w:fldCharType="separate"/>
-        </w:r>
-        <w:r>
-          <w:rPr>
-            <w:noProof/>
-            <w:webHidden/>
-          </w:rPr>
-          <w:t>8</w:t>
-        </w:r>
-        <w:r>
-          <w:rPr>
-            <w:noProof/>
-            <w:webHidden/>
-          </w:rPr>
-          <w:fldChar w:fldCharType="end"/>
-        </w:r>
-      </w:hyperlink>
+      <w:r>
+        <w:t>3.3. Estructura de Desglose del Trabajo (EDT / WBS)</w:t>
+        <w:tab/>
+        <w:t>8</w:t>
+      </w:r>
     </w:p>
     <w:p>
       <w:pPr>
@@ -1190,64 +1114,11 @@
           <w14:ligatures w14:val="standardContextual"/>
         </w:rPr>
       </w:pPr>
-      <w:hyperlink w:anchor="_Toc239448680" w:history="1">
-        <w:r>
-          <w:rPr>
-            <w:rStyle w:val="Hipervnculo"/>
-            <w:rFonts w:ascii="Arial" w:hAnsi="Arial"/>
-            <w:noProof/>
-          </w:rPr>
-          <w:t>3.3. Planificación de Sprints y Cronograma de Entregables</w:t>
-        </w:r>
-        <w:r>
-          <w:rPr>
-            <w:noProof/>
-            <w:webHidden/>
-          </w:rPr>
-          <w:tab/>
-        </w:r>
-        <w:r>
-          <w:rPr>
-            <w:noProof/>
-            <w:webHidden/>
-          </w:rPr>
-          <w:fldChar w:fldCharType="begin"/>
-        </w:r>
-        <w:r>
-          <w:rPr>
-            <w:noProof/>
-            <w:webHidden/>
-          </w:rPr>
-          <w:instrText xml:space="preserve"> PAGEREF _Toc239448680 \h </w:instrText>
-        </w:r>
-        <w:r>
-          <w:rPr>
-            <w:noProof/>
-            <w:webHidden/>
-          </w:rPr>
-        </w:r>
-        <w:r>
-          <w:rPr>
-            <w:noProof/>
-            <w:webHidden/>
-          </w:rPr>
-          <w:fldChar w:fldCharType="separate"/>
-        </w:r>
-        <w:r>
-          <w:rPr>
-            <w:noProof/>
-            <w:webHidden/>
-          </w:rPr>
-          <w:t>9</w:t>
-        </w:r>
-        <w:r>
-          <w:rPr>
-            <w:noProof/>
-            <w:webHidden/>
-          </w:rPr>
-          <w:fldChar w:fldCharType="end"/>
-        </w:r>
-      </w:hyperlink>
+      <w:r>
+        <w:t>3.4. Planificación de Sprints y Cronograma de Entregables</w:t>
+        <w:tab/>
+        <w:t>9</w:t>
+      </w:r>
     </w:p>
     <w:p>
       <w:pPr>
@@ -1264,64 +1135,11 @@
           <w14:ligatures w14:val="standardContextual"/>
         </w:rPr>
       </w:pPr>
-      <w:hyperlink w:anchor="_Toc239448681" w:history="1">
-        <w:r>
-          <w:rPr>
-            <w:rStyle w:val="Hipervnculo"/>
-            <w:rFonts w:ascii="Arial" w:hAnsi="Arial"/>
-            <w:noProof/>
-          </w:rPr>
-          <w:t>3.4. Matriz de Asignación de Responsabilidades (RACI)</w:t>
-        </w:r>
-        <w:r>
-          <w:rPr>
-            <w:noProof/>
-            <w:webHidden/>
-          </w:rPr>
-          <w:tab/>
-        </w:r>
-        <w:r>
-          <w:rPr>
-            <w:noProof/>
-            <w:webHidden/>
-          </w:rPr>
-          <w:fldChar w:fldCharType="begin"/>
-        </w:r>
-        <w:r>
-          <w:rPr>
-            <w:noProof/>
-            <w:webHidden/>
-          </w:rPr>
-          <w:instrText xml:space="preserve"> PAGEREF _Toc239448681 \h </w:instrText>
-        </w:r>
-        <w:r>
-          <w:rPr>
-            <w:noProof/>
-            <w:webHidden/>
-          </w:rPr>
-        </w:r>
-        <w:r>
-          <w:rPr>
-            <w:noProof/>
-            <w:webHidden/>
-          </w:rPr>
-          <w:fldChar w:fldCharType="separate"/>
-        </w:r>
-        <w:r>
-          <w:rPr>
-            <w:noProof/>
-            <w:webHidden/>
-          </w:rPr>
-          <w:t>10</w:t>
-        </w:r>
-        <w:r>
-          <w:rPr>
-            <w:noProof/>
-            <w:webHidden/>
-          </w:rPr>
-          <w:fldChar w:fldCharType="end"/>
-        </w:r>
-      </w:hyperlink>
+      <w:r>
+        <w:t>3.5. Matriz de Asignación de Responsabilidades (RACI)</w:t>
+        <w:tab/>
+        <w:t>10</w:t>
+      </w:r>
     </w:p>
     <w:p>
       <w:pPr>
@@ -4055,6 +3873,520 @@
         <w:t xml:space="preserve"> Desplegar la gestión de riesgos tecnológicos y operacionales a todos los actores supervisados del sistema financiero.</w:t>
       </w:r>
     </w:p>
+    <w:p>
+      <w:pPr>
+        <w:pStyle w:val="Ttulo2"/>
+      </w:pPr>
+      <w:r>
+        <w:t>1.5. Análisis del Entorno, Estrategias, Planes y Herramienta Canvas de Modelo de Negocio (BMC)</w:t>
+      </w:r>
+    </w:p>
+    <w:p>
+      <w:pPr/>
+      <w:r>
+        <w:t>Para garantizar que el sistema SIGIR-BCRP responda a la naturaleza corporativa y regulatoria del Banco Central, la definición del alcance del proyecto se estructura rigurosamente a partir de cinco aspectos estratégicos fundamentales:</w:t>
+      </w:r>
+    </w:p>
+    <w:p>
+      <w:pPr/>
+      <w:r>
+        <w:t>1. La Visión de la Empresa: La aspiración del BCRP de ser un organismo modelo de modernidad institucional y credibilidad internacional exige que sus herramientas de supervisión tecnológica se ubiquen a la vanguardia. El alcance del SIGIR-BCRP materializa esta visión al sustituir procesos manuales lentos por una arquitectura de telemetría reactiva en tiempo real con monitoreo asíncrono y estándares de alta disponibilidad.</w:t>
+      </w:r>
+    </w:p>
+    <w:p>
+      <w:pPr/>
+      <w:r>
+        <w:t>2. La Misión de la Empresa: La misión de preservar la estabilidad monetaria y fomentar un ecosistema eficiente de pagos mediante personal comprometido e informado se traduce en dotar a los analistas y operadores del NOC de visibilidad instantánea, fidedigna y libre de asimetrías de información sobre cada nodo del sistema financiero.</w:t>
+      </w:r>
+    </w:p>
+    <w:p>
+      <w:pPr/>
+      <w:r>
+        <w:t>3. El Entorno Operacional y Regulatorio: El entorno del Perú procesa más de 15 millones de transferencias inmediatas diarias entre Yape, Plim, Tunki, Caja de los Andes y el switch de la Cámara de Compensación Electrónica (CCE), regulado por la Circular BCRP N° 0011-2023-BCRP y la Ley N° 29440. El alcance del software cubre la interacción telemétrica directa con los endpoints de salud de todos los participantes.</w:t>
+      </w:r>
+    </w:p>
+    <w:p>
+      <w:pPr/>
+      <w:r>
+        <w:t>4. Las Estrategias de la Empresa: Alineadas a la Estrategia Nacional de Inclusión Financiera (ENIF) y a la Estrategia de Resiliencia del Sistema Nacional de Pagos, buscando cero asimetría de información y resiliencia ante contingencias.</w:t>
+      </w:r>
+    </w:p>
+    <w:p>
+      <w:pPr/>
+      <w:r>
+        <w:t>5. Los Planes de la Empresa: El alcance tributa directamente al Plan Estratégico Institucional (PEI 2022-2026) en sus Objetivos Estratégicos OEI 04, 10, 12 y 14, y al Plan de Continuidad Operativa de Sistemas de Liquidación Bruta en Tiempo Real (LBTR).</w:t>
+      </w:r>
+    </w:p>
+    <w:p>
+      <w:pPr>
+        <w:pStyle w:val="Ttulo3"/>
+      </w:pPr>
+      <w:r>
+        <w:t>1.5.1. Herramienta Canvas de Modelo de Negocio (Business Model Canvas - BMC)</w:t>
+      </w:r>
+    </w:p>
+    <w:tbl>
+      <w:tblPr>
+        <w:tblW w:type="auto" w:w="0"/>
+        <w:jc w:val="center"/>
+        <w:tblLook w:firstColumn="1" w:firstRow="1" w:lastColumn="0" w:lastRow="0" w:noHBand="0" w:noVBand="1" w:val="04A0"/>
+      </w:tblPr>
+      <w:tblGrid>
+        <w:gridCol w:w="3120"/>
+        <w:gridCol w:w="3120"/>
+        <w:gridCol w:w="3120"/>
+      </w:tblGrid>
+      <w:tr>
+        <w:tc>
+          <w:tcPr>
+            <w:tcW w:type="dxa" w:w="3120"/>
+            <w:shd w:fill="1E3A8A"/>
+            <w:tcMar>
+              <w:top w:w="80" w:type="dxa"/>
+              <w:bottom w:w="80" w:type="dxa"/>
+              <w:left w:w="100" w:type="dxa"/>
+              <w:right w:w="100" w:type="dxa"/>
+            </w:tcMar>
+          </w:tcPr>
+          <w:p>
+            <w:r>
+              <w:rPr>
+                <w:b/>
+                <w:color w:val="FFFFFF"/>
+                <w:sz w:val="18"/>
+              </w:rPr>
+              <w:t>SOCIOS CLAVE (Key Partners)</w:t>
+            </w:r>
+          </w:p>
+        </w:tc>
+        <w:tc>
+          <w:tcPr>
+            <w:tcW w:type="dxa" w:w="3120"/>
+            <w:shd w:fill="1E3A8A"/>
+            <w:tcMar>
+              <w:top w:w="80" w:type="dxa"/>
+              <w:bottom w:w="80" w:type="dxa"/>
+              <w:left w:w="100" w:type="dxa"/>
+              <w:right w:w="100" w:type="dxa"/>
+            </w:tcMar>
+          </w:tcPr>
+          <w:p>
+            <w:r>
+              <w:rPr>
+                <w:b/>
+                <w:color w:val="FFFFFF"/>
+                <w:sz w:val="18"/>
+              </w:rPr>
+              <w:t>ACTIVIDADES CLAVE (Key Activities)</w:t>
+            </w:r>
+          </w:p>
+        </w:tc>
+        <w:tc>
+          <w:tcPr>
+            <w:tcW w:type="dxa" w:w="3120"/>
+            <w:shd w:fill="1E3A8A"/>
+            <w:tcMar>
+              <w:top w:w="80" w:type="dxa"/>
+              <w:bottom w:w="80" w:type="dxa"/>
+              <w:left w:w="100" w:type="dxa"/>
+              <w:right w:w="100" w:type="dxa"/>
+            </w:tcMar>
+          </w:tcPr>
+          <w:p>
+            <w:r>
+              <w:rPr>
+                <w:b/>
+                <w:color w:val="FFFFFF"/>
+                <w:sz w:val="18"/>
+              </w:rPr>
+              <w:t>PROPUESTA DE VALOR (Value Proposition)</w:t>
+            </w:r>
+          </w:p>
+        </w:tc>
+      </w:tr>
+      <w:tr>
+        <w:tc>
+          <w:tcPr>
+            <w:tcW w:type="dxa" w:w="3120"/>
+            <w:shd w:fill="F8FAFC"/>
+            <w:tcMar>
+              <w:top w:w="80" w:type="dxa"/>
+              <w:bottom w:w="80" w:type="dxa"/>
+              <w:left w:w="100" w:type="dxa"/>
+              <w:right w:w="100" w:type="dxa"/>
+            </w:tcMar>
+          </w:tcPr>
+          <w:p>
+            <w:r>
+              <w:rPr>
+                <w:sz w:val="17"/>
+              </w:rPr>
+              <w:t>• Cámara de Compensación Electrónica (CCE)</w:t>
+              <w:br/>
+              <w:t>• Bancos: BCP (Yape), Interbank (Plim)</w:t>
+              <w:br/>
+              <w:t>• Microfinancieras: CMAC Cusco (Tunki), CRAC Los Andes</w:t>
+              <w:br/>
+              <w:t>• División Ciberseguridad BCRP</w:t>
+              <w:br/>
+              <w:t>• Proveedores de Servidores y Red Privada</w:t>
+            </w:r>
+          </w:p>
+        </w:tc>
+        <w:tc>
+          <w:tcPr>
+            <w:tcW w:type="dxa" w:w="3120"/>
+            <w:shd w:fill="F8FAFC"/>
+            <w:tcMar>
+              <w:top w:w="80" w:type="dxa"/>
+              <w:bottom w:w="80" w:type="dxa"/>
+              <w:left w:w="100" w:type="dxa"/>
+              <w:right w:w="100" w:type="dxa"/>
+            </w:tcMar>
+          </w:tcPr>
+          <w:p>
+            <w:r>
+              <w:rPr>
+                <w:sz w:val="17"/>
+              </w:rPr>
+              <w:t>• Sondeo telemétrico asíncrono (polling 30s)</w:t>
+              <w:br/>
+              <w:t>• Auto-categorización HTTP 5xx / timeout</w:t>
+              <w:br/>
+              <w:t>• Registro manual de fraudes y brechas</w:t>
+              <w:br/>
+              <w:t>• Gestión de máquina de estados inmutable</w:t>
+              <w:br/>
+              <w:t>• Compilación SFT con hash SHA-256</w:t>
+            </w:r>
+          </w:p>
+        </w:tc>
+        <w:tc>
+          <w:tcPr>
+            <w:tcW w:type="dxa" w:w="3120"/>
+            <w:shd w:fill="F8FAFC"/>
+            <w:tcMar>
+              <w:top w:w="80" w:type="dxa"/>
+              <w:bottom w:w="80" w:type="dxa"/>
+              <w:left w:w="100" w:type="dxa"/>
+              <w:right w:w="100" w:type="dxa"/>
+            </w:tcMar>
+          </w:tcPr>
+          <w:p>
+            <w:r>
+              <w:rPr>
+                <w:sz w:val="17"/>
+              </w:rPr>
+              <w:t>• Observabilidad en Tiempo Real (&lt;30s)</w:t>
+              <w:br/>
+              <w:t>• Cero Asimetría de Información</w:t>
+              <w:br/>
+              <w:t>• Integridad Criptográfica SHA-256</w:t>
+              <w:br/>
+              <w:t>• Autenticación Única con Directorio Activo</w:t>
+              <w:br/>
+              <w:t>• Mitigación de Riesgo Sistémico Nacional</w:t>
+            </w:r>
+          </w:p>
+        </w:tc>
+      </w:tr>
+      <w:tr>
+        <w:tc>
+          <w:tcPr>
+            <w:tcW w:type="dxa" w:w="3120"/>
+            <w:shd w:fill="1E3A8A"/>
+            <w:tcMar>
+              <w:top w:w="80" w:type="dxa"/>
+              <w:bottom w:w="80" w:type="dxa"/>
+              <w:left w:w="100" w:type="dxa"/>
+              <w:right w:w="100" w:type="dxa"/>
+            </w:tcMar>
+          </w:tcPr>
+          <w:p>
+            <w:r>
+              <w:rPr>
+                <w:b/>
+                <w:color w:val="FFFFFF"/>
+                <w:sz w:val="18"/>
+              </w:rPr>
+              <w:t>RECURSOS CLAVE (Key Resources)</w:t>
+            </w:r>
+          </w:p>
+        </w:tc>
+        <w:tc>
+          <w:tcPr>
+            <w:tcW w:type="dxa" w:w="3120"/>
+            <w:shd w:fill="1E3A8A"/>
+            <w:tcMar>
+              <w:top w:w="80" w:type="dxa"/>
+              <w:bottom w:w="80" w:type="dxa"/>
+              <w:left w:w="100" w:type="dxa"/>
+              <w:right w:w="100" w:type="dxa"/>
+            </w:tcMar>
+          </w:tcPr>
+          <w:p>
+            <w:r>
+              <w:rPr>
+                <w:b/>
+                <w:color w:val="FFFFFF"/>
+                <w:sz w:val="18"/>
+              </w:rPr>
+              <w:t>RELACIONES CON CLIENTES</w:t>
+            </w:r>
+          </w:p>
+        </w:tc>
+        <w:tc>
+          <w:tcPr>
+            <w:tcW w:type="dxa" w:w="3120"/>
+            <w:shd w:fill="1E3A8A"/>
+            <w:tcMar>
+              <w:top w:w="80" w:type="dxa"/>
+              <w:bottom w:w="80" w:type="dxa"/>
+              <w:left w:w="100" w:type="dxa"/>
+              <w:right w:w="100" w:type="dxa"/>
+            </w:tcMar>
+          </w:tcPr>
+          <w:p>
+            <w:r>
+              <w:rPr>
+                <w:b/>
+                <w:color w:val="FFFFFF"/>
+                <w:sz w:val="18"/>
+              </w:rPr>
+              <w:t>SEGMENTOS DE CLIENTES</w:t>
+            </w:r>
+          </w:p>
+        </w:tc>
+      </w:tr>
+      <w:tr>
+        <w:tc>
+          <w:tcPr>
+            <w:tcW w:type="dxa" w:w="3120"/>
+            <w:shd w:fill="F8FAFC"/>
+            <w:tcMar>
+              <w:top w:w="80" w:type="dxa"/>
+              <w:bottom w:w="80" w:type="dxa"/>
+              <w:left w:w="100" w:type="dxa"/>
+              <w:right w:w="100" w:type="dxa"/>
+            </w:tcMar>
+          </w:tcPr>
+          <w:p>
+            <w:r>
+              <w:rPr>
+                <w:sz w:val="17"/>
+              </w:rPr>
+              <w:t>• Backend Clúster Java 17 / Spring Boot 3</w:t>
+              <w:br/>
+              <w:t>• Motor PostgreSQL 15 con triggers inmutables</w:t>
+              <w:br/>
+              <w:t>• Servidor LDAPS Active Directory (636)</w:t>
+              <w:br/>
+              <w:t>• Ingenieros y Analistas de Estabilidad Financiera</w:t>
+            </w:r>
+          </w:p>
+        </w:tc>
+        <w:tc>
+          <w:tcPr>
+            <w:tcW w:type="dxa" w:w="3120"/>
+            <w:shd w:fill="F8FAFC"/>
+            <w:tcMar>
+              <w:top w:w="80" w:type="dxa"/>
+              <w:bottom w:w="80" w:type="dxa"/>
+              <w:left w:w="100" w:type="dxa"/>
+              <w:right w:w="100" w:type="dxa"/>
+            </w:tcMar>
+          </w:tcPr>
+          <w:p>
+            <w:r>
+              <w:rPr>
+                <w:sz w:val="17"/>
+              </w:rPr>
+              <w:t>• Supervisión automatizada sin fricción</w:t>
+              <w:br/>
+              <w:t>• Mesa de ayuda regulatoria institucional</w:t>
+              <w:br/>
+              <w:t>• Auditoría forense inmutable con validez legal</w:t>
+              <w:br/>
+              <w:t>• Control de acceso RBAC estricto</w:t>
+            </w:r>
+          </w:p>
+        </w:tc>
+        <w:tc>
+          <w:tcPr>
+            <w:tcW w:type="dxa" w:w="3120"/>
+            <w:shd w:fill="F8FAFC"/>
+            <w:tcMar>
+              <w:top w:w="80" w:type="dxa"/>
+              <w:bottom w:w="80" w:type="dxa"/>
+              <w:left w:w="100" w:type="dxa"/>
+              <w:right w:w="100" w:type="dxa"/>
+            </w:tcMar>
+          </w:tcPr>
+          <w:p>
+            <w:r>
+              <w:rPr>
+                <w:sz w:val="17"/>
+              </w:rPr>
+              <w:t>• Gerencia de Operaciones Monetarias BCRP</w:t>
+              <w:br/>
+              <w:t>• Operadores de Salas NOC BCRP</w:t>
+              <w:br/>
+              <w:t>• Oficiales de TI de entidades financieras</w:t>
+              <w:br/>
+              <w:t>• Beneficiario Indirecto: Ciudadanía peruana</w:t>
+            </w:r>
+          </w:p>
+        </w:tc>
+      </w:tr>
+      <w:tr>
+        <w:tc>
+          <w:tcPr>
+            <w:tcW w:type="dxa" w:w="3120"/>
+            <w:shd w:fill="1E3A8A"/>
+            <w:tcMar>
+              <w:top w:w="80" w:type="dxa"/>
+              <w:bottom w:w="80" w:type="dxa"/>
+              <w:left w:w="100" w:type="dxa"/>
+              <w:right w:w="100" w:type="dxa"/>
+            </w:tcMar>
+          </w:tcPr>
+          <w:p>
+            <w:r>
+              <w:rPr>
+                <w:b/>
+                <w:color w:val="FFFFFF"/>
+                <w:sz w:val="18"/>
+              </w:rPr>
+              <w:t>ESTRUCTURA DE COSTOS (Cost Structure)</w:t>
+            </w:r>
+          </w:p>
+        </w:tc>
+        <w:tc>
+          <w:tcPr>
+            <w:tcW w:type="dxa" w:w="3120"/>
+            <w:shd w:fill="1E3A8A"/>
+            <w:tcMar>
+              <w:top w:w="80" w:type="dxa"/>
+              <w:bottom w:w="80" w:type="dxa"/>
+              <w:left w:w="100" w:type="dxa"/>
+              <w:right w:w="100" w:type="dxa"/>
+            </w:tcMar>
+          </w:tcPr>
+          <w:p>
+            <w:r>
+              <w:rPr>
+                <w:b/>
+                <w:color w:val="FFFFFF"/>
+                <w:sz w:val="18"/>
+              </w:rPr>
+              <w:t>CANALES DE DISTRIBUCIÓN (Channels)</w:t>
+            </w:r>
+          </w:p>
+        </w:tc>
+        <w:tc>
+          <w:tcPr>
+            <w:tcW w:type="dxa" w:w="3120"/>
+            <w:shd w:fill="1E3A8A"/>
+            <w:tcMar>
+              <w:top w:w="80" w:type="dxa"/>
+              <w:bottom w:w="80" w:type="dxa"/>
+              <w:left w:w="100" w:type="dxa"/>
+              <w:right w:w="100" w:type="dxa"/>
+            </w:tcMar>
+          </w:tcPr>
+          <w:p>
+            <w:r>
+              <w:rPr>
+                <w:b/>
+                <w:color w:val="FFFFFF"/>
+                <w:sz w:val="18"/>
+              </w:rPr>
+              <w:t>FUENTES DE VALOR / RETORNO PÚBLICO</w:t>
+            </w:r>
+          </w:p>
+        </w:tc>
+      </w:tr>
+      <w:tr>
+        <w:tc>
+          <w:tcPr>
+            <w:tcW w:type="dxa" w:w="3120"/>
+            <w:shd w:fill="F8FAFC"/>
+            <w:tcMar>
+              <w:top w:w="80" w:type="dxa"/>
+              <w:bottom w:w="80" w:type="dxa"/>
+              <w:left w:w="100" w:type="dxa"/>
+              <w:right w:w="100" w:type="dxa"/>
+            </w:tcMar>
+          </w:tcPr>
+          <w:p>
+            <w:r>
+              <w:rPr>
+                <w:sz w:val="17"/>
+              </w:rPr>
+              <w:t>• Desarrollo e ingeniería de software (Scrum)</w:t>
+              <w:br/>
+              <w:t>• Servidores dedicados y conectividad segura</w:t>
+              <w:br/>
+              <w:t>• Ciberseguridad y certificados TLS/SSL</w:t>
+              <w:br/>
+              <w:t>• Mantenimiento y soporte 24/7 sala NOC</w:t>
+            </w:r>
+          </w:p>
+        </w:tc>
+        <w:tc>
+          <w:tcPr>
+            <w:tcW w:type="dxa" w:w="3120"/>
+            <w:shd w:fill="F8FAFC"/>
+            <w:tcMar>
+              <w:top w:w="80" w:type="dxa"/>
+              <w:bottom w:w="80" w:type="dxa"/>
+              <w:left w:w="100" w:type="dxa"/>
+              <w:right w:w="100" w:type="dxa"/>
+            </w:tcMar>
+          </w:tcPr>
+          <w:p>
+            <w:r>
+              <w:rPr>
+                <w:sz w:val="17"/>
+              </w:rPr>
+              <w:t>• Consola Web NOC interactiva en tiempo real</w:t>
+              <w:br/>
+              <w:t>• APIs RESTful con documentación OpenAPI 3.0</w:t>
+              <w:br/>
+              <w:t>• Servidor SFTP oficial para reportes SFT</w:t>
+              <w:br/>
+              <w:t>• Red corporativa cerrada interbancaria</w:t>
+            </w:r>
+          </w:p>
+        </w:tc>
+        <w:tc>
+          <w:tcPr>
+            <w:tcW w:type="dxa" w:w="3120"/>
+            <w:shd w:fill="F8FAFC"/>
+            <w:tcMar>
+              <w:top w:w="80" w:type="dxa"/>
+              <w:bottom w:w="80" w:type="dxa"/>
+              <w:left w:w="100" w:type="dxa"/>
+              <w:right w:w="100" w:type="dxa"/>
+            </w:tcMar>
+          </w:tcPr>
+          <w:p>
+            <w:r>
+              <w:rPr>
+                <w:sz w:val="17"/>
+              </w:rPr>
+              <w:t>• Estabilidad monetaria y confianza en pagos</w:t>
+              <w:br/>
+              <w:t>• Ahorro en pérdidas transaccionales masivas</w:t>
+              <w:br/>
+              <w:t>• Cobro de penalidades justificadas por SLAs</w:t>
+              <w:br/>
+              <w:t>• Cero horas de contingencias encubiertas</w:t>
+            </w:r>
+          </w:p>
+        </w:tc>
+      </w:tr>
+    </w:tbl>
     <w:p>
       <w:pPr>
         <w:pStyle w:val="Ttulo1"/>
@@ -4919,6 +5251,968 @@
     </w:p>
     <w:p>
       <w:pPr>
+        <w:pStyle w:val="Ttulo2"/>
+      </w:pPr>
+      <w:r>
+        <w:t>2.5. Planteamiento y Evaluación de Alternativas de Solución (TIC &amp; Java)</w:t>
+      </w:r>
+    </w:p>
+    <w:p>
+      <w:pPr/>
+      <w:r>
+        <w:t>Para responder con rigor a la problemática de detección tardía y asimetría de información en el Sistema Nacional de Pagos, se plantearon y evaluaron tres alternativas tecnológicas integrales aplicando las TIC. Todas cumplen con el requisito obligatorio de poseer más del 50% de componentes desarrollados en el ecosistema Java y cuentan con no menos de 5 pantallas diseñadas:</w:t>
+      </w:r>
+    </w:p>
+    <w:p>
+      <w:pPr>
+        <w:pStyle w:val="Ttulo3"/>
+      </w:pPr>
+      <w:r>
+        <w:t>2.5.1. Alternativa 1: Monolito Empresarial MVC en Java Puro (Spring Boot 3 + Thymeleaf + PostgreSQL)</w:t>
+      </w:r>
+    </w:p>
+    <w:p>
+      <w:pPr/>
+      <w:r>
+        <w:t>• Arquitectura y Peso Java: 85% Java. Monolito modular con renderizado en servidor (SSR) mediante Spring MVC, Thymeleaf, Spring Security y Hibernate. El procesamiento y presentación residen en una sola JVM.</w:t>
+        <w:br/>
+        <w:t>• Especificación de 5 Pantallas Diseñadas:</w:t>
+        <w:br/>
+        <w:t xml:space="preserve">  1. Pantalla 1 (Login AD): Formulario institucional de captura de credenciales contra Active Directory vía LDAP con control de bloqueo de cuenta.</w:t>
+        <w:br/>
+        <w:t xml:space="preserve">  2. Pantalla 2 (Tablero de Entidades SSR): Tabla dinámica generada por el servidor que lista participantes (BCP, Interbank, Cajas, CCE) y estado de salud mediante recarga periódica de página.</w:t>
+        <w:br/>
+        <w:t xml:space="preserve">  3. Pantalla 3 (Formulario de Captura de Incidentes): Formulario estructurado con validación Hibernate Validator (@NotNull, @Size), campos de severidad, categoría e impacto de clientes.</w:t>
+        <w:br/>
+        <w:t xml:space="preserve">  4. Pantalla 4 (Bitácora de Auditoría de Estados): Vista de detalle del ticket donde el operador avanza la máquina de estados con descargo técnico en tabla append-only.</w:t>
+        <w:br/>
+        <w:t xml:space="preserve">  5. Pantalla 5 (Módulo de Descarga SFT): Selector de fecha para compilar el texto plano delimitado por pipes y descargar el archivo .TXT con hash SHA-256.</w:t>
+        <w:br/>
+        <w:t>• Evaluación: Fácil despliegue, pero baja reactividad al requerir recarga completa de página en la consola de monitoreo.</w:t>
+      </w:r>
+    </w:p>
+    <w:p>
+      <w:pPr>
+        <w:pStyle w:val="Ttulo3"/>
+      </w:pPr>
+      <w:r>
+        <w:t>2.5.2. Alternativa 2 (Seleccionada): Arquitectura Desacoplada Hexagonal (Spring Boot 3 REST API + Consola Web Reactiva + PostgreSQL)</w:t>
+      </w:r>
+    </w:p>
+    <w:p>
+      <w:pPr/>
+      <w:r>
+        <w:t>• Arquitectura y Peso Java: 65% Java. Backend 100% Java 17 con Arquitectura Hexagonal (Ports &amp; Adapters), Spring Boot 3, Worker asíncrono con CompletableFuture, Spring Security AD y PostgreSQL; 35% en capa cliente SPA reactiva (HTML5/CSS3/JS) para monitoreo NOC continuo en tiempo real.</w:t>
+        <w:br/>
+        <w:t>• Especificación de 5 Pantallas Diseñadas e Implementadas:</w:t>
+        <w:br/>
+        <w:t xml:space="preserve">  1. Pantalla 1 (Encabezado de Sesión y Monitor Backend): Barra superior con tarjeta de usuario Active Directory (AD\frank.vargas@bcrp.local), rol NOC_LEAD y píldora de conectividad REST reactiva.</w:t>
+        <w:br/>
+        <w:t xml:space="preserve">  2. Pantalla 2 (Barra de Semáforos de Telemetría en Vivo): Grid interactivo de entidades con latencia en ms, badges semafóricos (Operacional, Degradado, Fuera de Servicio) y cuenta regresiva de sondeo (30s).</w:t>
+        <w:br/>
+        <w:t xml:space="preserve">  3. Pantalla 3 (Matriz de Seguimiento y Ciclo de Vida): Panel con KPIs resumen, filtros combinados (buscador, severidad, estado) y tabla de incidentes con botones de acción directa.</w:t>
+        <w:br/>
+        <w:t xml:space="preserve">  4. Pantalla 4 (Modal Asistido de Registro Forense): Modal ergonómico para tipificar contingencias de Fraude Financiero y Brechas de Información con impacto transaccional y traza técnica.</w:t>
+        <w:br/>
+        <w:t xml:space="preserve">  5. Pantalla 5 (Modal Visor y Compilador SFT BCRP): Modal de visualización del archivo plano oficial de supervisión, bloque criptográfico con digest SHA-256 y descarga en 1 clic del archivo .TXT.</w:t>
+        <w:br/>
+        <w:t>• Evaluación: Excelente separación de responsabilidades, alta velocidad de sondeo paralela (&lt;30s) y ergonomía NOC de vanguardia.</w:t>
+      </w:r>
+    </w:p>
+    <w:p>
+      <w:pPr>
+        <w:pStyle w:val="Ttulo3"/>
+      </w:pPr>
+      <w:r>
+        <w:t>2.5.3. Alternativa 3: Arquitectura Distribuida Basada en Eventos (Spring Cloud + Apache Kafka + Microservicios Java)</w:t>
+      </w:r>
+    </w:p>
+    <w:p>
+      <w:pPr/>
+      <w:r>
+        <w:t>• Arquitectura y Peso Java: 75% Java. Microservicios autónomos en Spring Boot coreografiados por un bus de streaming Apache Kafka, Spring Cloud Gateway y frontend web (25%).</w:t>
+        <w:br/>
+        <w:t>• Especificación de 5 Pantallas Diseñadas:</w:t>
+        <w:br/>
+        <w:t xml:space="preserve">  1. Pantalla 1 (API Gateway SSO): Autenticación OAuth2 / OIDC articulada con el Directorio Activo institucional.</w:t>
+        <w:br/>
+        <w:t xml:space="preserve">  2. Pantalla 2 (Tablero de Tópicos Kafka): Monitor de caudal de eventos telemétricos por segundo y estado de consumidores por banco.</w:t>
+        <w:br/>
+        <w:t xml:space="preserve">  3. Pantalla 3 (Consola de Gestión de Colas y Eventos): Vista de eventos de caída en colas de procesamiento y Dead Letter Queue (DLQ).</w:t>
+        <w:br/>
+        <w:t xml:space="preserve">  4. Pantalla 4 (Centro Forense de Trazas Distribuidas): Visualización de trazas OpenTelemetry con TraceId y SpanId inter-microservicios.</w:t>
+        <w:br/>
+        <w:t xml:space="preserve">  5. Pantalla 5 (Panel de Despacho Batch a SFTP BCRP): Orquestador programado de lotes de reportes normativos transmitidos al servidor SFTP.</w:t>
+        <w:br/>
+        <w:t>• Evaluación: Escalabilidad masiva, pero introduce costos elevados de infraestructura y sobrecomplejidad operativa innecesaria para el alcance actual.</w:t>
+      </w:r>
+    </w:p>
+    <w:p>
+      <w:pPr>
+        <w:pStyle w:val="Ttulo3"/>
+      </w:pPr>
+      <w:r>
+        <w:t>2.5.4. Matriz de Decisión y Selección Multicriterio de Ingeniería</w:t>
+      </w:r>
+    </w:p>
+    <w:tbl>
+      <w:tblPr>
+        <w:tblW w:type="auto" w:w="0"/>
+        <w:jc w:val="center"/>
+        <w:tblLook w:firstColumn="1" w:firstRow="1" w:lastColumn="0" w:lastRow="0" w:noHBand="0" w:noVBand="1" w:val="04A0"/>
+      </w:tblPr>
+      <w:tblGrid>
+        <w:gridCol w:w="1872"/>
+        <w:gridCol w:w="1872"/>
+        <w:gridCol w:w="1872"/>
+        <w:gridCol w:w="1872"/>
+        <w:gridCol w:w="1872"/>
+      </w:tblGrid>
+      <w:tr>
+        <w:tc>
+          <w:tcPr>
+            <w:tcW w:type="dxa" w:w="1872"/>
+            <w:shd w:fill="1E3A8A"/>
+            <w:tcMar>
+              <w:top w:w="60" w:type="dxa"/>
+              <w:bottom w:w="60" w:type="dxa"/>
+              <w:left w:w="80" w:type="dxa"/>
+              <w:right w:w="80" w:type="dxa"/>
+            </w:tcMar>
+          </w:tcPr>
+          <w:p>
+            <w:r>
+              <w:rPr>
+                <w:b/>
+                <w:color w:val="FFFFFF"/>
+                <w:sz w:val="17"/>
+              </w:rPr>
+              <w:t>Criterio de Evaluación</w:t>
+            </w:r>
+          </w:p>
+        </w:tc>
+        <w:tc>
+          <w:tcPr>
+            <w:tcW w:type="dxa" w:w="1872"/>
+            <w:shd w:fill="1E3A8A"/>
+            <w:tcMar>
+              <w:top w:w="60" w:type="dxa"/>
+              <w:bottom w:w="60" w:type="dxa"/>
+              <w:left w:w="80" w:type="dxa"/>
+              <w:right w:w="80" w:type="dxa"/>
+            </w:tcMar>
+          </w:tcPr>
+          <w:p>
+            <w:r>
+              <w:rPr>
+                <w:b/>
+                <w:color w:val="FFFFFF"/>
+                <w:sz w:val="17"/>
+              </w:rPr>
+              <w:t>Peso</w:t>
+            </w:r>
+          </w:p>
+        </w:tc>
+        <w:tc>
+          <w:tcPr>
+            <w:tcW w:type="dxa" w:w="1872"/>
+            <w:shd w:fill="1E3A8A"/>
+            <w:tcMar>
+              <w:top w:w="60" w:type="dxa"/>
+              <w:bottom w:w="60" w:type="dxa"/>
+              <w:left w:w="80" w:type="dxa"/>
+              <w:right w:w="80" w:type="dxa"/>
+            </w:tcMar>
+          </w:tcPr>
+          <w:p>
+            <w:r>
+              <w:rPr>
+                <w:b/>
+                <w:color w:val="FFFFFF"/>
+                <w:sz w:val="17"/>
+              </w:rPr>
+              <w:t>Alt 1: Monolito MVC</w:t>
+            </w:r>
+          </w:p>
+        </w:tc>
+        <w:tc>
+          <w:tcPr>
+            <w:tcW w:type="dxa" w:w="1872"/>
+            <w:shd w:fill="1E3A8A"/>
+            <w:tcMar>
+              <w:top w:w="60" w:type="dxa"/>
+              <w:bottom w:w="60" w:type="dxa"/>
+              <w:left w:w="80" w:type="dxa"/>
+              <w:right w:w="80" w:type="dxa"/>
+            </w:tcMar>
+          </w:tcPr>
+          <w:p>
+            <w:r>
+              <w:rPr>
+                <w:b/>
+                <w:color w:val="FFFFFF"/>
+                <w:sz w:val="17"/>
+              </w:rPr>
+              <w:t>Alt 2: Hexagonal (Seleccionada)</w:t>
+            </w:r>
+          </w:p>
+        </w:tc>
+        <w:tc>
+          <w:tcPr>
+            <w:tcW w:type="dxa" w:w="1872"/>
+            <w:shd w:fill="1E3A8A"/>
+            <w:tcMar>
+              <w:top w:w="60" w:type="dxa"/>
+              <w:bottom w:w="60" w:type="dxa"/>
+              <w:left w:w="80" w:type="dxa"/>
+              <w:right w:w="80" w:type="dxa"/>
+            </w:tcMar>
+          </w:tcPr>
+          <w:p>
+            <w:r>
+              <w:rPr>
+                <w:b/>
+                <w:color w:val="FFFFFF"/>
+                <w:sz w:val="17"/>
+              </w:rPr>
+              <w:t>Alt 3: Event Kafka</w:t>
+            </w:r>
+          </w:p>
+        </w:tc>
+      </w:tr>
+      <w:tr>
+        <w:tc>
+          <w:tcPr>
+            <w:tcW w:type="dxa" w:w="1872"/>
+            <w:shd w:fill="F1F5F9"/>
+            <w:tcMar>
+              <w:top w:w="60" w:type="dxa"/>
+              <w:bottom w:w="60" w:type="dxa"/>
+              <w:left w:w="80" w:type="dxa"/>
+              <w:right w:w="80" w:type="dxa"/>
+            </w:tcMar>
+          </w:tcPr>
+          <w:p>
+            <w:r>
+              <w:rPr>
+                <w:sz w:val="16"/>
+              </w:rPr>
+              <w:t>Latencia de Detección (&lt;30s)</w:t>
+            </w:r>
+          </w:p>
+        </w:tc>
+        <w:tc>
+          <w:tcPr>
+            <w:tcW w:type="dxa" w:w="1872"/>
+            <w:shd w:fill="F1F5F9"/>
+            <w:tcMar>
+              <w:top w:w="60" w:type="dxa"/>
+              <w:bottom w:w="60" w:type="dxa"/>
+              <w:left w:w="80" w:type="dxa"/>
+              <w:right w:w="80" w:type="dxa"/>
+            </w:tcMar>
+          </w:tcPr>
+          <w:p>
+            <w:r>
+              <w:rPr>
+                <w:sz w:val="16"/>
+              </w:rPr>
+              <w:t>20%</w:t>
+            </w:r>
+          </w:p>
+        </w:tc>
+        <w:tc>
+          <w:tcPr>
+            <w:tcW w:type="dxa" w:w="1872"/>
+            <w:shd w:fill="F1F5F9"/>
+            <w:tcMar>
+              <w:top w:w="60" w:type="dxa"/>
+              <w:bottom w:w="60" w:type="dxa"/>
+              <w:left w:w="80" w:type="dxa"/>
+              <w:right w:w="80" w:type="dxa"/>
+            </w:tcMar>
+          </w:tcPr>
+          <w:p>
+            <w:r>
+              <w:rPr>
+                <w:sz w:val="16"/>
+              </w:rPr>
+              <w:t>3.0 (0.60)</w:t>
+            </w:r>
+          </w:p>
+        </w:tc>
+        <w:tc>
+          <w:tcPr>
+            <w:tcW w:type="dxa" w:w="1872"/>
+            <w:shd w:fill="F1F5F9"/>
+            <w:tcMar>
+              <w:top w:w="60" w:type="dxa"/>
+              <w:bottom w:w="60" w:type="dxa"/>
+              <w:left w:w="80" w:type="dxa"/>
+              <w:right w:w="80" w:type="dxa"/>
+            </w:tcMar>
+          </w:tcPr>
+          <w:p>
+            <w:r>
+              <w:rPr>
+                <w:b/>
+                <w:sz w:val="16"/>
+              </w:rPr>
+              <w:t>5.0 (1.00)</w:t>
+            </w:r>
+          </w:p>
+        </w:tc>
+        <w:tc>
+          <w:tcPr>
+            <w:tcW w:type="dxa" w:w="1872"/>
+            <w:shd w:fill="F1F5F9"/>
+            <w:tcMar>
+              <w:top w:w="60" w:type="dxa"/>
+              <w:bottom w:w="60" w:type="dxa"/>
+              <w:left w:w="80" w:type="dxa"/>
+              <w:right w:w="80" w:type="dxa"/>
+            </w:tcMar>
+          </w:tcPr>
+          <w:p>
+            <w:r>
+              <w:rPr>
+                <w:sz w:val="16"/>
+              </w:rPr>
+              <w:t>4.8 (0.96)</w:t>
+            </w:r>
+          </w:p>
+        </w:tc>
+      </w:tr>
+      <w:tr>
+        <w:tc>
+          <w:tcPr>
+            <w:tcW w:type="dxa" w:w="1872"/>
+            <w:shd w:fill="FFFFFF"/>
+            <w:tcMar>
+              <w:top w:w="60" w:type="dxa"/>
+              <w:bottom w:w="60" w:type="dxa"/>
+              <w:left w:w="80" w:type="dxa"/>
+              <w:right w:w="80" w:type="dxa"/>
+            </w:tcMar>
+          </w:tcPr>
+          <w:p>
+            <w:r>
+              <w:rPr>
+                <w:sz w:val="16"/>
+              </w:rPr>
+              <w:t>Ergonomía Sala NOC</w:t>
+            </w:r>
+          </w:p>
+        </w:tc>
+        <w:tc>
+          <w:tcPr>
+            <w:tcW w:type="dxa" w:w="1872"/>
+            <w:shd w:fill="FFFFFF"/>
+            <w:tcMar>
+              <w:top w:w="60" w:type="dxa"/>
+              <w:bottom w:w="60" w:type="dxa"/>
+              <w:left w:w="80" w:type="dxa"/>
+              <w:right w:w="80" w:type="dxa"/>
+            </w:tcMar>
+          </w:tcPr>
+          <w:p>
+            <w:r>
+              <w:rPr>
+                <w:sz w:val="16"/>
+              </w:rPr>
+              <w:t>15%</w:t>
+            </w:r>
+          </w:p>
+        </w:tc>
+        <w:tc>
+          <w:tcPr>
+            <w:tcW w:type="dxa" w:w="1872"/>
+            <w:shd w:fill="FFFFFF"/>
+            <w:tcMar>
+              <w:top w:w="60" w:type="dxa"/>
+              <w:bottom w:w="60" w:type="dxa"/>
+              <w:left w:w="80" w:type="dxa"/>
+              <w:right w:w="80" w:type="dxa"/>
+            </w:tcMar>
+          </w:tcPr>
+          <w:p>
+            <w:r>
+              <w:rPr>
+                <w:sz w:val="16"/>
+              </w:rPr>
+              <w:t>2.5 (0.38)</w:t>
+            </w:r>
+          </w:p>
+        </w:tc>
+        <w:tc>
+          <w:tcPr>
+            <w:tcW w:type="dxa" w:w="1872"/>
+            <w:shd w:fill="FFFFFF"/>
+            <w:tcMar>
+              <w:top w:w="60" w:type="dxa"/>
+              <w:bottom w:w="60" w:type="dxa"/>
+              <w:left w:w="80" w:type="dxa"/>
+              <w:right w:w="80" w:type="dxa"/>
+            </w:tcMar>
+          </w:tcPr>
+          <w:p>
+            <w:r>
+              <w:rPr>
+                <w:b/>
+                <w:sz w:val="16"/>
+              </w:rPr>
+              <w:t>5.0 (0.75)</w:t>
+            </w:r>
+          </w:p>
+        </w:tc>
+        <w:tc>
+          <w:tcPr>
+            <w:tcW w:type="dxa" w:w="1872"/>
+            <w:shd w:fill="FFFFFF"/>
+            <w:tcMar>
+              <w:top w:w="60" w:type="dxa"/>
+              <w:bottom w:w="60" w:type="dxa"/>
+              <w:left w:w="80" w:type="dxa"/>
+              <w:right w:w="80" w:type="dxa"/>
+            </w:tcMar>
+          </w:tcPr>
+          <w:p>
+            <w:r>
+              <w:rPr>
+                <w:sz w:val="16"/>
+              </w:rPr>
+              <w:t>4.0 (0.60)</w:t>
+            </w:r>
+          </w:p>
+        </w:tc>
+      </w:tr>
+      <w:tr>
+        <w:tc>
+          <w:tcPr>
+            <w:tcW w:type="dxa" w:w="1872"/>
+            <w:shd w:fill="F1F5F9"/>
+            <w:tcMar>
+              <w:top w:w="60" w:type="dxa"/>
+              <w:bottom w:w="60" w:type="dxa"/>
+              <w:left w:w="80" w:type="dxa"/>
+              <w:right w:w="80" w:type="dxa"/>
+            </w:tcMar>
+          </w:tcPr>
+          <w:p>
+            <w:r>
+              <w:rPr>
+                <w:sz w:val="16"/>
+              </w:rPr>
+              <w:t>Eficiencia de Infraestructura</w:t>
+            </w:r>
+          </w:p>
+        </w:tc>
+        <w:tc>
+          <w:tcPr>
+            <w:tcW w:type="dxa" w:w="1872"/>
+            <w:shd w:fill="F1F5F9"/>
+            <w:tcMar>
+              <w:top w:w="60" w:type="dxa"/>
+              <w:bottom w:w="60" w:type="dxa"/>
+              <w:left w:w="80" w:type="dxa"/>
+              <w:right w:w="80" w:type="dxa"/>
+            </w:tcMar>
+          </w:tcPr>
+          <w:p>
+            <w:r>
+              <w:rPr>
+                <w:sz w:val="16"/>
+              </w:rPr>
+              <w:t>15%</w:t>
+            </w:r>
+          </w:p>
+        </w:tc>
+        <w:tc>
+          <w:tcPr>
+            <w:tcW w:type="dxa" w:w="1872"/>
+            <w:shd w:fill="F1F5F9"/>
+            <w:tcMar>
+              <w:top w:w="60" w:type="dxa"/>
+              <w:bottom w:w="60" w:type="dxa"/>
+              <w:left w:w="80" w:type="dxa"/>
+              <w:right w:w="80" w:type="dxa"/>
+            </w:tcMar>
+          </w:tcPr>
+          <w:p>
+            <w:r>
+              <w:rPr>
+                <w:sz w:val="16"/>
+              </w:rPr>
+              <w:t>4.5 (0.68)</w:t>
+            </w:r>
+          </w:p>
+        </w:tc>
+        <w:tc>
+          <w:tcPr>
+            <w:tcW w:type="dxa" w:w="1872"/>
+            <w:shd w:fill="F1F5F9"/>
+            <w:tcMar>
+              <w:top w:w="60" w:type="dxa"/>
+              <w:bottom w:w="60" w:type="dxa"/>
+              <w:left w:w="80" w:type="dxa"/>
+              <w:right w:w="80" w:type="dxa"/>
+            </w:tcMar>
+          </w:tcPr>
+          <w:p>
+            <w:r>
+              <w:rPr>
+                <w:b/>
+                <w:sz w:val="16"/>
+              </w:rPr>
+              <w:t>4.8 (0.72)</w:t>
+            </w:r>
+          </w:p>
+        </w:tc>
+        <w:tc>
+          <w:tcPr>
+            <w:tcW w:type="dxa" w:w="1872"/>
+            <w:shd w:fill="F1F5F9"/>
+            <w:tcMar>
+              <w:top w:w="60" w:type="dxa"/>
+              <w:bottom w:w="60" w:type="dxa"/>
+              <w:left w:w="80" w:type="dxa"/>
+              <w:right w:w="80" w:type="dxa"/>
+            </w:tcMar>
+          </w:tcPr>
+          <w:p>
+            <w:r>
+              <w:rPr>
+                <w:sz w:val="16"/>
+              </w:rPr>
+              <w:t>2.0 (0.30)</w:t>
+            </w:r>
+          </w:p>
+        </w:tc>
+      </w:tr>
+      <w:tr>
+        <w:tc>
+          <w:tcPr>
+            <w:tcW w:type="dxa" w:w="1872"/>
+            <w:shd w:fill="FFFFFF"/>
+            <w:tcMar>
+              <w:top w:w="60" w:type="dxa"/>
+              <w:bottom w:w="60" w:type="dxa"/>
+              <w:left w:w="80" w:type="dxa"/>
+              <w:right w:w="80" w:type="dxa"/>
+            </w:tcMar>
+          </w:tcPr>
+          <w:p>
+            <w:r>
+              <w:rPr>
+                <w:sz w:val="16"/>
+              </w:rPr>
+              <w:t>Desacoplamiento Clean / SOLID</w:t>
+            </w:r>
+          </w:p>
+        </w:tc>
+        <w:tc>
+          <w:tcPr>
+            <w:tcW w:type="dxa" w:w="1872"/>
+            <w:shd w:fill="FFFFFF"/>
+            <w:tcMar>
+              <w:top w:w="60" w:type="dxa"/>
+              <w:bottom w:w="60" w:type="dxa"/>
+              <w:left w:w="80" w:type="dxa"/>
+              <w:right w:w="80" w:type="dxa"/>
+            </w:tcMar>
+          </w:tcPr>
+          <w:p>
+            <w:r>
+              <w:rPr>
+                <w:sz w:val="16"/>
+              </w:rPr>
+              <w:t>20%</w:t>
+            </w:r>
+          </w:p>
+        </w:tc>
+        <w:tc>
+          <w:tcPr>
+            <w:tcW w:type="dxa" w:w="1872"/>
+            <w:shd w:fill="FFFFFF"/>
+            <w:tcMar>
+              <w:top w:w="60" w:type="dxa"/>
+              <w:bottom w:w="60" w:type="dxa"/>
+              <w:left w:w="80" w:type="dxa"/>
+              <w:right w:w="80" w:type="dxa"/>
+            </w:tcMar>
+          </w:tcPr>
+          <w:p>
+            <w:r>
+              <w:rPr>
+                <w:sz w:val="16"/>
+              </w:rPr>
+              <w:t>2.8 (0.56)</w:t>
+            </w:r>
+          </w:p>
+        </w:tc>
+        <w:tc>
+          <w:tcPr>
+            <w:tcW w:type="dxa" w:w="1872"/>
+            <w:shd w:fill="FFFFFF"/>
+            <w:tcMar>
+              <w:top w:w="60" w:type="dxa"/>
+              <w:bottom w:w="60" w:type="dxa"/>
+              <w:left w:w="80" w:type="dxa"/>
+              <w:right w:w="80" w:type="dxa"/>
+            </w:tcMar>
+          </w:tcPr>
+          <w:p>
+            <w:r>
+              <w:rPr>
+                <w:b/>
+                <w:sz w:val="16"/>
+              </w:rPr>
+              <w:t>5.0 (1.00)</w:t>
+            </w:r>
+          </w:p>
+        </w:tc>
+        <w:tc>
+          <w:tcPr>
+            <w:tcW w:type="dxa" w:w="1872"/>
+            <w:shd w:fill="FFFFFF"/>
+            <w:tcMar>
+              <w:top w:w="60" w:type="dxa"/>
+              <w:bottom w:w="60" w:type="dxa"/>
+              <w:left w:w="80" w:type="dxa"/>
+              <w:right w:w="80" w:type="dxa"/>
+            </w:tcMar>
+          </w:tcPr>
+          <w:p>
+            <w:r>
+              <w:rPr>
+                <w:sz w:val="16"/>
+              </w:rPr>
+              <w:t>4.8 (0.96)</w:t>
+            </w:r>
+          </w:p>
+        </w:tc>
+      </w:tr>
+      <w:tr>
+        <w:tc>
+          <w:tcPr>
+            <w:tcW w:type="dxa" w:w="1872"/>
+            <w:shd w:fill="F1F5F9"/>
+            <w:tcMar>
+              <w:top w:w="60" w:type="dxa"/>
+              <w:bottom w:w="60" w:type="dxa"/>
+              <w:left w:w="80" w:type="dxa"/>
+              <w:right w:w="80" w:type="dxa"/>
+            </w:tcMar>
+          </w:tcPr>
+          <w:p>
+            <w:r>
+              <w:rPr>
+                <w:sz w:val="16"/>
+              </w:rPr>
+              <w:t>Alineación con Circular BCRP</w:t>
+            </w:r>
+          </w:p>
+        </w:tc>
+        <w:tc>
+          <w:tcPr>
+            <w:tcW w:type="dxa" w:w="1872"/>
+            <w:shd w:fill="F1F5F9"/>
+            <w:tcMar>
+              <w:top w:w="60" w:type="dxa"/>
+              <w:bottom w:w="60" w:type="dxa"/>
+              <w:left w:w="80" w:type="dxa"/>
+              <w:right w:w="80" w:type="dxa"/>
+            </w:tcMar>
+          </w:tcPr>
+          <w:p>
+            <w:r>
+              <w:rPr>
+                <w:sz w:val="16"/>
+              </w:rPr>
+              <w:t>15%</w:t>
+            </w:r>
+          </w:p>
+        </w:tc>
+        <w:tc>
+          <w:tcPr>
+            <w:tcW w:type="dxa" w:w="1872"/>
+            <w:shd w:fill="F1F5F9"/>
+            <w:tcMar>
+              <w:top w:w="60" w:type="dxa"/>
+              <w:bottom w:w="60" w:type="dxa"/>
+              <w:left w:w="80" w:type="dxa"/>
+              <w:right w:w="80" w:type="dxa"/>
+            </w:tcMar>
+          </w:tcPr>
+          <w:p>
+            <w:r>
+              <w:rPr>
+                <w:sz w:val="16"/>
+              </w:rPr>
+              <w:t>4.0 (0.60)</w:t>
+            </w:r>
+          </w:p>
+        </w:tc>
+        <w:tc>
+          <w:tcPr>
+            <w:tcW w:type="dxa" w:w="1872"/>
+            <w:shd w:fill="F1F5F9"/>
+            <w:tcMar>
+              <w:top w:w="60" w:type="dxa"/>
+              <w:bottom w:w="60" w:type="dxa"/>
+              <w:left w:w="80" w:type="dxa"/>
+              <w:right w:w="80" w:type="dxa"/>
+            </w:tcMar>
+          </w:tcPr>
+          <w:p>
+            <w:r>
+              <w:rPr>
+                <w:b/>
+                <w:sz w:val="16"/>
+              </w:rPr>
+              <w:t>5.0 (0.75)</w:t>
+            </w:r>
+          </w:p>
+        </w:tc>
+        <w:tc>
+          <w:tcPr>
+            <w:tcW w:type="dxa" w:w="1872"/>
+            <w:shd w:fill="F1F5F9"/>
+            <w:tcMar>
+              <w:top w:w="60" w:type="dxa"/>
+              <w:bottom w:w="60" w:type="dxa"/>
+              <w:left w:w="80" w:type="dxa"/>
+              <w:right w:w="80" w:type="dxa"/>
+            </w:tcMar>
+          </w:tcPr>
+          <w:p>
+            <w:r>
+              <w:rPr>
+                <w:sz w:val="16"/>
+              </w:rPr>
+              <w:t>4.2 (0.63)</w:t>
+            </w:r>
+          </w:p>
+        </w:tc>
+      </w:tr>
+      <w:tr>
+        <w:tc>
+          <w:tcPr>
+            <w:tcW w:type="dxa" w:w="1872"/>
+            <w:shd w:fill="FFFFFF"/>
+            <w:tcMar>
+              <w:top w:w="60" w:type="dxa"/>
+              <w:bottom w:w="60" w:type="dxa"/>
+              <w:left w:w="80" w:type="dxa"/>
+              <w:right w:w="80" w:type="dxa"/>
+            </w:tcMar>
+          </w:tcPr>
+          <w:p>
+            <w:r>
+              <w:rPr>
+                <w:sz w:val="16"/>
+              </w:rPr>
+              <w:t>Cumplimiento TIC (&gt;=50% Java)</w:t>
+            </w:r>
+          </w:p>
+        </w:tc>
+        <w:tc>
+          <w:tcPr>
+            <w:tcW w:type="dxa" w:w="1872"/>
+            <w:shd w:fill="FFFFFF"/>
+            <w:tcMar>
+              <w:top w:w="60" w:type="dxa"/>
+              <w:bottom w:w="60" w:type="dxa"/>
+              <w:left w:w="80" w:type="dxa"/>
+              <w:right w:w="80" w:type="dxa"/>
+            </w:tcMar>
+          </w:tcPr>
+          <w:p>
+            <w:r>
+              <w:rPr>
+                <w:sz w:val="16"/>
+              </w:rPr>
+              <w:t>15%</w:t>
+            </w:r>
+          </w:p>
+        </w:tc>
+        <w:tc>
+          <w:tcPr>
+            <w:tcW w:type="dxa" w:w="1872"/>
+            <w:shd w:fill="FFFFFF"/>
+            <w:tcMar>
+              <w:top w:w="60" w:type="dxa"/>
+              <w:bottom w:w="60" w:type="dxa"/>
+              <w:left w:w="80" w:type="dxa"/>
+              <w:right w:w="80" w:type="dxa"/>
+            </w:tcMar>
+          </w:tcPr>
+          <w:p>
+            <w:r>
+              <w:rPr>
+                <w:sz w:val="16"/>
+              </w:rPr>
+              <w:t>5.0 (0.75)</w:t>
+            </w:r>
+          </w:p>
+        </w:tc>
+        <w:tc>
+          <w:tcPr>
+            <w:tcW w:type="dxa" w:w="1872"/>
+            <w:shd w:fill="FFFFFF"/>
+            <w:tcMar>
+              <w:top w:w="60" w:type="dxa"/>
+              <w:bottom w:w="60" w:type="dxa"/>
+              <w:left w:w="80" w:type="dxa"/>
+              <w:right w:w="80" w:type="dxa"/>
+            </w:tcMar>
+          </w:tcPr>
+          <w:p>
+            <w:r>
+              <w:rPr>
+                <w:b/>
+                <w:sz w:val="16"/>
+              </w:rPr>
+              <w:t>5.0 (0.75)</w:t>
+            </w:r>
+          </w:p>
+        </w:tc>
+        <w:tc>
+          <w:tcPr>
+            <w:tcW w:type="dxa" w:w="1872"/>
+            <w:shd w:fill="FFFFFF"/>
+            <w:tcMar>
+              <w:top w:w="60" w:type="dxa"/>
+              <w:bottom w:w="60" w:type="dxa"/>
+              <w:left w:w="80" w:type="dxa"/>
+              <w:right w:w="80" w:type="dxa"/>
+            </w:tcMar>
+          </w:tcPr>
+          <w:p>
+            <w:r>
+              <w:rPr>
+                <w:sz w:val="16"/>
+              </w:rPr>
+              <w:t>5.0 (0.75)</w:t>
+            </w:r>
+          </w:p>
+        </w:tc>
+      </w:tr>
+      <w:tr>
+        <w:tc>
+          <w:tcPr>
+            <w:tcW w:type="dxa" w:w="1872"/>
+            <w:shd w:fill="0F172A"/>
+            <w:tcMar>
+              <w:top w:w="60" w:type="dxa"/>
+              <w:bottom w:w="60" w:type="dxa"/>
+              <w:left w:w="80" w:type="dxa"/>
+              <w:right w:w="80" w:type="dxa"/>
+            </w:tcMar>
+          </w:tcPr>
+          <w:p>
+            <w:r>
+              <w:rPr>
+                <w:b/>
+                <w:color w:val="FFFFFF"/>
+                <w:sz w:val="17"/>
+              </w:rPr>
+              <w:t>PUNTAJE PONDERADO TOTAL</w:t>
+            </w:r>
+          </w:p>
+        </w:tc>
+        <w:tc>
+          <w:tcPr>
+            <w:tcW w:type="dxa" w:w="1872"/>
+            <w:shd w:fill="0F172A"/>
+            <w:tcMar>
+              <w:top w:w="60" w:type="dxa"/>
+              <w:bottom w:w="60" w:type="dxa"/>
+              <w:left w:w="80" w:type="dxa"/>
+              <w:right w:w="80" w:type="dxa"/>
+            </w:tcMar>
+          </w:tcPr>
+          <w:p>
+            <w:r>
+              <w:rPr>
+                <w:b/>
+                <w:color w:val="FFFFFF"/>
+                <w:sz w:val="17"/>
+              </w:rPr>
+              <w:t>100%</w:t>
+            </w:r>
+          </w:p>
+        </w:tc>
+        <w:tc>
+          <w:tcPr>
+            <w:tcW w:type="dxa" w:w="1872"/>
+            <w:shd w:fill="0F172A"/>
+            <w:tcMar>
+              <w:top w:w="60" w:type="dxa"/>
+              <w:bottom w:w="60" w:type="dxa"/>
+              <w:left w:w="80" w:type="dxa"/>
+              <w:right w:w="80" w:type="dxa"/>
+            </w:tcMar>
+          </w:tcPr>
+          <w:p>
+            <w:r>
+              <w:rPr>
+                <w:b/>
+                <w:color w:val="FFFFFF"/>
+                <w:sz w:val="17"/>
+              </w:rPr>
+              <w:t>3.57 / 5.00</w:t>
+            </w:r>
+          </w:p>
+        </w:tc>
+        <w:tc>
+          <w:tcPr>
+            <w:tcW w:type="dxa" w:w="1872"/>
+            <w:shd w:fill="0F172A"/>
+            <w:tcMar>
+              <w:top w:w="60" w:type="dxa"/>
+              <w:bottom w:w="60" w:type="dxa"/>
+              <w:left w:w="80" w:type="dxa"/>
+              <w:right w:w="80" w:type="dxa"/>
+            </w:tcMar>
+          </w:tcPr>
+          <w:p>
+            <w:r>
+              <w:rPr>
+                <w:b/>
+                <w:color w:val="FFFFFF"/>
+                <w:sz w:val="17"/>
+              </w:rPr>
+              <w:t>4.97 / 5.00</w:t>
+            </w:r>
+          </w:p>
+        </w:tc>
+        <w:tc>
+          <w:tcPr>
+            <w:tcW w:type="dxa" w:w="1872"/>
+            <w:shd w:fill="0F172A"/>
+            <w:tcMar>
+              <w:top w:w="60" w:type="dxa"/>
+              <w:bottom w:w="60" w:type="dxa"/>
+              <w:left w:w="80" w:type="dxa"/>
+              <w:right w:w="80" w:type="dxa"/>
+            </w:tcMar>
+          </w:tcPr>
+          <w:p>
+            <w:r>
+              <w:rPr>
+                <w:b/>
+                <w:color w:val="FFFFFF"/>
+                <w:sz w:val="17"/>
+              </w:rPr>
+              <w:t>4.20 / 5.00</w:t>
+            </w:r>
+          </w:p>
+        </w:tc>
+      </w:tr>
+    </w:tbl>
+    <w:p>
+      <w:pPr>
         <w:pStyle w:val="Ttulo1"/>
         <w:spacing w:before="320"/>
         <w:jc w:val="center"/>
@@ -4935,16 +6229,396 @@
     <w:p>
       <w:pPr>
         <w:pStyle w:val="Ttulo2"/>
+      </w:pPr>
+      <w:r>
+        <w:t>3.1. Project Charter Básico (Acta de Constitución del Proyecto)</w:t>
+      </w:r>
+    </w:p>
+    <w:p>
+      <w:pPr/>
+      <w:r>
+        <w:t>A continuación, se formaliza el Acta de Constitución del Proyecto estructurada según los estándares del PMI y alineada al marco ágil Scrum:</w:t>
+      </w:r>
+    </w:p>
+    <w:tbl>
+      <w:tblPr>
+        <w:tblW w:type="auto" w:w="0"/>
+        <w:jc w:val="center"/>
+        <w:tblLook w:firstColumn="1" w:firstRow="1" w:lastColumn="0" w:lastRow="0" w:noHBand="0" w:noVBand="1" w:val="04A0"/>
+      </w:tblPr>
+      <w:tblGrid>
+        <w:gridCol w:w="4680"/>
+        <w:gridCol w:w="4680"/>
+      </w:tblGrid>
+      <w:tr>
+        <w:tc>
+          <w:tcPr>
+            <w:tcW w:type="dxa" w:w="4680"/>
+            <w:shd w:fill="1E3A8A"/>
+            <w:tcMar>
+              <w:top w:w="60" w:type="dxa"/>
+              <w:bottom w:w="60" w:type="dxa"/>
+              <w:left w:w="80" w:type="dxa"/>
+              <w:right w:w="80" w:type="dxa"/>
+            </w:tcMar>
+          </w:tcPr>
+          <w:p>
+            <w:r>
+              <w:rPr>
+                <w:b/>
+                <w:color w:val="FFFFFF"/>
+                <w:sz w:val="17"/>
+              </w:rPr>
+              <w:t>Nombre del Proyecto / Código</w:t>
+            </w:r>
+          </w:p>
+        </w:tc>
+        <w:tc>
+          <w:tcPr>
+            <w:tcW w:type="dxa" w:w="4680"/>
+            <w:shd w:fill="F8FAFC"/>
+            <w:tcMar>
+              <w:top w:w="60" w:type="dxa"/>
+              <w:bottom w:w="60" w:type="dxa"/>
+              <w:left w:w="80" w:type="dxa"/>
+              <w:right w:w="80" w:type="dxa"/>
+            </w:tcMar>
+          </w:tcPr>
+          <w:p>
+            <w:r>
+              <w:rPr>
+                <w:sz w:val="17"/>
+              </w:rPr>
+              <w:t>Sistema Integral de Gestión de Incidentes Regulatorios (SIGIR - BCRP) | PRJ-2026-SIGIR-57524</w:t>
+            </w:r>
+          </w:p>
+        </w:tc>
+      </w:tr>
+      <w:tr>
+        <w:tc>
+          <w:tcPr>
+            <w:tcW w:type="dxa" w:w="4680"/>
+            <w:shd w:fill="1E3A8A"/>
+            <w:tcMar>
+              <w:top w:w="60" w:type="dxa"/>
+              <w:bottom w:w="60" w:type="dxa"/>
+              <w:left w:w="80" w:type="dxa"/>
+              <w:right w:w="80" w:type="dxa"/>
+            </w:tcMar>
+          </w:tcPr>
+          <w:p>
+            <w:r>
+              <w:rPr>
+                <w:b/>
+                <w:color w:val="FFFFFF"/>
+                <w:sz w:val="17"/>
+              </w:rPr>
+              <w:t>Patrocinador (PO) / Líder Técnico</w:t>
+            </w:r>
+          </w:p>
+        </w:tc>
+        <w:tc>
+          <w:tcPr>
+            <w:tcW w:type="dxa" w:w="4680"/>
+            <w:shd w:fill="F8FAFC"/>
+            <w:tcMar>
+              <w:top w:w="60" w:type="dxa"/>
+              <w:bottom w:w="60" w:type="dxa"/>
+              <w:left w:w="80" w:type="dxa"/>
+              <w:right w:w="80" w:type="dxa"/>
+            </w:tcMar>
+          </w:tcPr>
+          <w:p>
+            <w:r>
+              <w:rPr>
+                <w:sz w:val="17"/>
+              </w:rPr>
+              <w:t>Ing. Yony Zamata Condori (Docente UTP) | Frank Emiliano Vargas Huamán (Estudiante UTP)</w:t>
+            </w:r>
+          </w:p>
+        </w:tc>
+      </w:tr>
+      <w:tr>
+        <w:tc>
+          <w:tcPr>
+            <w:tcW w:type="dxa" w:w="4680"/>
+            <w:shd w:fill="1E3A8A"/>
+            <w:tcMar>
+              <w:top w:w="60" w:type="dxa"/>
+              <w:bottom w:w="60" w:type="dxa"/>
+              <w:left w:w="80" w:type="dxa"/>
+              <w:right w:w="80" w:type="dxa"/>
+            </w:tcMar>
+          </w:tcPr>
+          <w:p>
+            <w:r>
+              <w:rPr>
+                <w:b/>
+                <w:color w:val="FFFFFF"/>
+                <w:sz w:val="17"/>
+              </w:rPr>
+              <w:t>Justificación del Proyecto</w:t>
+            </w:r>
+          </w:p>
+        </w:tc>
+        <w:tc>
+          <w:tcPr>
+            <w:tcW w:type="dxa" w:w="4680"/>
+            <w:shd w:fill="F8FAFC"/>
+            <w:tcMar>
+              <w:top w:w="60" w:type="dxa"/>
+              <w:bottom w:w="60" w:type="dxa"/>
+              <w:left w:w="80" w:type="dxa"/>
+              <w:right w:w="80" w:type="dxa"/>
+            </w:tcMar>
+          </w:tcPr>
+          <w:p>
+            <w:r>
+              <w:rPr>
+                <w:sz w:val="17"/>
+              </w:rPr>
+              <w:t>Erradicar la detección tardía de caídas en transferencias inmediatas peruanas (Yape, Plim, CCE), reduciendo el MTTD de 180 min a &lt;30s con auditoría forense inmutable y reporte SFT con SHA-256.</w:t>
+            </w:r>
+          </w:p>
+        </w:tc>
+      </w:tr>
+      <w:tr>
+        <w:tc>
+          <w:tcPr>
+            <w:tcW w:type="dxa" w:w="4680"/>
+            <w:shd w:fill="1E3A8A"/>
+            <w:tcMar>
+              <w:top w:w="60" w:type="dxa"/>
+              <w:bottom w:w="60" w:type="dxa"/>
+              <w:left w:w="80" w:type="dxa"/>
+              <w:right w:w="80" w:type="dxa"/>
+            </w:tcMar>
+          </w:tcPr>
+          <w:p>
+            <w:r>
+              <w:rPr>
+                <w:b/>
+                <w:color w:val="FFFFFF"/>
+                <w:sz w:val="17"/>
+              </w:rPr>
+              <w:t>Objetivos SMART</w:t>
+            </w:r>
+          </w:p>
+        </w:tc>
+        <w:tc>
+          <w:tcPr>
+            <w:tcW w:type="dxa" w:w="4680"/>
+            <w:shd w:fill="F8FAFC"/>
+            <w:tcMar>
+              <w:top w:w="60" w:type="dxa"/>
+              <w:bottom w:w="60" w:type="dxa"/>
+              <w:left w:w="80" w:type="dxa"/>
+              <w:right w:w="80" w:type="dxa"/>
+            </w:tcMar>
+          </w:tcPr>
+          <w:p>
+            <w:r>
+              <w:rPr>
+                <w:sz w:val="17"/>
+              </w:rPr>
+              <w:t>• Alcance: 100% de módulos core (Mantenimiento, Telemetría, Incidentes, Seguridad AD, SFT).</w:t>
+              <w:br/>
+              <w:t>• Tiempo: 6 Sprints en 14 semanas (Hito APF1 en Semana 4).</w:t>
+              <w:br/>
+              <w:t>• Rendimiento: Sondeo asíncrono cada 30s con respuesta REST &lt; 500ms.</w:t>
+              <w:br/>
+              <w:t>• Calidad: Cobertura &gt; 80% con JUnit 5 y cero mutabilidad en auditoría SQL.</w:t>
+            </w:r>
+          </w:p>
+        </w:tc>
+      </w:tr>
+      <w:tr>
+        <w:tc>
+          <w:tcPr>
+            <w:tcW w:type="dxa" w:w="4680"/>
+            <w:shd w:fill="1E3A8A"/>
+            <w:tcMar>
+              <w:top w:w="60" w:type="dxa"/>
+              <w:bottom w:w="60" w:type="dxa"/>
+              <w:left w:w="80" w:type="dxa"/>
+              <w:right w:w="80" w:type="dxa"/>
+            </w:tcMar>
+          </w:tcPr>
+          <w:p>
+            <w:r>
+              <w:rPr>
+                <w:b/>
+                <w:color w:val="FFFFFF"/>
+                <w:sz w:val="17"/>
+              </w:rPr>
+              <w:t>Alcance Entregable APF1</w:t>
+            </w:r>
+          </w:p>
+        </w:tc>
+        <w:tc>
+          <w:tcPr>
+            <w:tcW w:type="dxa" w:w="4680"/>
+            <w:shd w:fill="F8FAFC"/>
+            <w:tcMar>
+              <w:top w:w="60" w:type="dxa"/>
+              <w:bottom w:w="60" w:type="dxa"/>
+              <w:left w:w="80" w:type="dxa"/>
+              <w:right w:w="80" w:type="dxa"/>
+            </w:tcMar>
+          </w:tcPr>
+          <w:p>
+            <w:r>
+              <w:rPr>
+                <w:sz w:val="17"/>
+              </w:rPr>
+              <w:t>Modelado BPMN 2.0, requisitos IEEE 830, DDL PostgreSQL 15 con triggers inmutables, backend Spring Boot 3 con Arquitectura Hexagonal, Worker de telemetría, consola NOC reactiva y suite de tests.</w:t>
+            </w:r>
+          </w:p>
+        </w:tc>
+      </w:tr>
+      <w:tr>
+        <w:tc>
+          <w:tcPr>
+            <w:tcW w:type="dxa" w:w="4680"/>
+            <w:shd w:fill="1E3A8A"/>
+            <w:tcMar>
+              <w:top w:w="60" w:type="dxa"/>
+              <w:bottom w:w="60" w:type="dxa"/>
+              <w:left w:w="80" w:type="dxa"/>
+              <w:right w:w="80" w:type="dxa"/>
+            </w:tcMar>
+          </w:tcPr>
+          <w:p>
+            <w:r>
+              <w:rPr>
+                <w:b/>
+                <w:color w:val="FFFFFF"/>
+                <w:sz w:val="17"/>
+              </w:rPr>
+              <w:t>Supuestos y Restricciones</w:t>
+            </w:r>
+          </w:p>
+        </w:tc>
+        <w:tc>
+          <w:tcPr>
+            <w:tcW w:type="dxa" w:w="4680"/>
+            <w:shd w:fill="F8FAFC"/>
+            <w:tcMar>
+              <w:top w:w="60" w:type="dxa"/>
+              <w:bottom w:w="60" w:type="dxa"/>
+              <w:left w:w="80" w:type="dxa"/>
+              <w:right w:w="80" w:type="dxa"/>
+            </w:tcMar>
+          </w:tcPr>
+          <w:p>
+            <w:r>
+              <w:rPr>
+                <w:sz w:val="17"/>
+              </w:rPr>
+              <w:t>• Supuestos: APIs bancarias exponen endpoints de health check; servidor Active Directory en LDAPS 636.</w:t>
+              <w:br/>
+              <w:t>• Restricciones: Mínimo 50% de peso en Java 17; cumplimiento estricto de circular BCRP; prohibido UPDATE/DELETE en historial.</w:t>
+            </w:r>
+          </w:p>
+        </w:tc>
+      </w:tr>
+      <w:tr>
+        <w:tc>
+          <w:tcPr>
+            <w:tcW w:type="dxa" w:w="4680"/>
+            <w:shd w:fill="1E3A8A"/>
+            <w:tcMar>
+              <w:top w:w="60" w:type="dxa"/>
+              <w:bottom w:w="60" w:type="dxa"/>
+              <w:left w:w="80" w:type="dxa"/>
+              <w:right w:w="80" w:type="dxa"/>
+            </w:tcMar>
+          </w:tcPr>
+          <w:p>
+            <w:r>
+              <w:rPr>
+                <w:b/>
+                <w:color w:val="FFFFFF"/>
+                <w:sz w:val="17"/>
+              </w:rPr>
+              <w:t>Cronograma de Hitos</w:t>
+            </w:r>
+          </w:p>
+        </w:tc>
+        <w:tc>
+          <w:tcPr>
+            <w:tcW w:type="dxa" w:w="4680"/>
+            <w:shd w:fill="F8FAFC"/>
+            <w:tcMar>
+              <w:top w:w="60" w:type="dxa"/>
+              <w:bottom w:w="60" w:type="dxa"/>
+              <w:left w:w="80" w:type="dxa"/>
+              <w:right w:w="80" w:type="dxa"/>
+            </w:tcMar>
+          </w:tcPr>
+          <w:p>
+            <w:r>
+              <w:rPr>
+                <w:sz w:val="17"/>
+              </w:rPr>
+              <w:t>Hito 1: Marco y Requisitos (Semana 3) | Hito 2: Entregable APF1 (Semana 4) | Hito 3: KPIs y Cierre (Semana 14).</w:t>
+            </w:r>
+          </w:p>
+        </w:tc>
+      </w:tr>
+      <w:tr>
+        <w:tc>
+          <w:tcPr>
+            <w:tcW w:type="dxa" w:w="4680"/>
+            <w:shd w:fill="1E3A8A"/>
+            <w:tcMar>
+              <w:top w:w="60" w:type="dxa"/>
+              <w:bottom w:w="60" w:type="dxa"/>
+              <w:left w:w="80" w:type="dxa"/>
+              <w:right w:w="80" w:type="dxa"/>
+            </w:tcMar>
+          </w:tcPr>
+          <w:p>
+            <w:r>
+              <w:rPr>
+                <w:b/>
+                <w:color w:val="FFFFFF"/>
+                <w:sz w:val="17"/>
+              </w:rPr>
+              <w:t>Gestión de Riesgos</w:t>
+            </w:r>
+          </w:p>
+        </w:tc>
+        <w:tc>
+          <w:tcPr>
+            <w:tcW w:type="dxa" w:w="4680"/>
+            <w:shd w:fill="F8FAFC"/>
+            <w:tcMar>
+              <w:top w:w="60" w:type="dxa"/>
+              <w:bottom w:w="60" w:type="dxa"/>
+              <w:left w:w="80" w:type="dxa"/>
+              <w:right w:w="80" w:type="dxa"/>
+            </w:tcMar>
+          </w:tcPr>
+          <w:p>
+            <w:r>
+              <w:rPr>
+                <w:sz w:val="17"/>
+              </w:rPr>
+              <w:t>R-01 Sobrecarga por sondeo (mitigado con timeout de 3s); R-02 Alteración de historial (mitigado con trigger append-only SQL); R-03 Caída de AD (mitigado con fallback seguro).</w:t>
+            </w:r>
+          </w:p>
+        </w:tc>
+      </w:tr>
+    </w:tbl>
+    <w:p>
+      <w:pPr>
+        <w:pStyle w:val="Ttulo2"/>
         <w:spacing w:before="240"/>
       </w:pPr>
-      <w:bookmarkStart w:id="11" w:name="_Toc239448678"/>
-      <w:r>
-        <w:rPr>
-          <w:rFonts w:ascii="Arial" w:hAnsi="Arial"/>
-        </w:rPr>
-        <w:t>3.1. Marco Metodológico Ágil Adaptado a Entornos Regulados</w:t>
-      </w:r>
-      <w:bookmarkEnd w:id="11"/>
+      <w:r>
+        <w:t>3.2. Marco Metodológico Ágil Adaptado a Entornos Regulados</w:t>
+      </w:r>
     </w:p>
     <w:p>
       <w:pPr>
@@ -4964,14 +6638,9 @@
         <w:pStyle w:val="Ttulo2"/>
         <w:spacing w:before="240"/>
       </w:pPr>
-      <w:bookmarkStart w:id="12" w:name="_Toc239448679"/>
-      <w:r>
-        <w:rPr>
-          <w:rFonts w:ascii="Arial" w:hAnsi="Arial"/>
-        </w:rPr>
-        <w:t>3.2. Estructura de Desglose del Trabajo (EDT / WBS)</w:t>
-      </w:r>
-      <w:bookmarkEnd w:id="12"/>
+      <w:r>
+        <w:t>3.3. Estructura de Desglose del Trabajo (EDT / WBS)</w:t>
+      </w:r>
     </w:p>
     <w:p>
       <w:pPr>
@@ -5212,14 +6881,9 @@
         <w:pStyle w:val="Ttulo2"/>
         <w:spacing w:before="240"/>
       </w:pPr>
-      <w:bookmarkStart w:id="13" w:name="_Toc239448680"/>
-      <w:r>
-        <w:rPr>
-          <w:rFonts w:ascii="Arial" w:hAnsi="Arial"/>
-        </w:rPr>
-        <w:t>3.3. Planificación de Sprints y Cronograma de Entregables</w:t>
-      </w:r>
-      <w:bookmarkEnd w:id="13"/>
+      <w:r>
+        <w:t>3.4. Planificación de Sprints y Cronograma de Entregables</w:t>
+      </w:r>
     </w:p>
     <w:p>
       <w:pPr>
@@ -6133,14 +7797,9 @@
         <w:pStyle w:val="Ttulo2"/>
         <w:spacing w:before="240"/>
       </w:pPr>
-      <w:bookmarkStart w:id="14" w:name="_Toc239448681"/>
-      <w:r>
-        <w:rPr>
-          <w:rFonts w:ascii="Arial" w:hAnsi="Arial"/>
-        </w:rPr>
-        <w:t>3.4. Matriz de Asignación de Responsabilidades (RACI)</w:t>
-      </w:r>
-      <w:bookmarkEnd w:id="14"/>
+      <w:r>
+        <w:t>3.5. Matriz de Asignación de Responsabilidades (RACI)</w:t>
+      </w:r>
     </w:p>
     <w:p>
       <w:pPr>

</xml_diff>

<commit_message>
docs: actualizar caratula con integrantes del equipo y codigos UTP en informe docx, pdf y markdown
</commit_message>
<xml_diff>
--- a/01_DOCUMENTACION_TECNICA/INFORME_ACADEMICO_APF1_COMPLETO.docx
+++ b/01_DOCUMENTACION_TECNICA/INFORME_ACADEMICO_APF1_COMPLETO.docx
@@ -59,69 +59,177 @@
           <w:rFonts w:ascii="Arial" w:hAnsi="Arial"/>
           <w:b/>
           <w:color w:val="0F172A"/>
-          <w:sz w:val="24"/>
-        </w:rPr>
-        <w:t>Frank Emiliano Vargas Huamán</w:t>
+          <w:sz w:val="23"/>
+        </w:rPr>
+        <w:t>INTEGRANTES DEL EQUIPO:</w:t>
+        <w:br/>
+      </w:r>
+      <w:r>
+        <w:rPr>
+          <w:rFonts w:ascii="Arial" w:hAnsi="Arial"/>
+          <w:color w:val="1E293B"/>
+          <w:sz w:val="21"/>
+        </w:rPr>
+        <w:t xml:space="preserve">• </w:t>
       </w:r>
       <w:r>
         <w:rPr>
           <w:rFonts w:ascii="Arial" w:hAnsi="Arial"/>
           <w:b/>
           <w:color w:val="0F172A"/>
-          <w:sz w:val="24"/>
-        </w:rPr>
-        <w:br/>
+          <w:sz w:val="21"/>
+        </w:rPr>
+        <w:t xml:space="preserve">Frank Emiliano Vargas Huamán </w:t>
       </w:r>
       <w:r>
         <w:rPr>
           <w:rFonts w:ascii="Arial" w:hAnsi="Arial"/>
           <w:color w:val="334155"/>
-        </w:rPr>
-        <w:t>Facultad de Ingeniería de Sistemas e Informática, Universidad Tecnológica del Perú</w:t>
+          <w:sz w:val="21"/>
+        </w:rPr>
+        <w:t>– Código: U23243651</w:t>
+      </w:r>
+      <w:r>
+        <w:rPr>
+          <w:rFonts w:ascii="Arial" w:hAnsi="Arial"/>
+          <w:i/>
+          <w:color w:val="64748B"/>
+          <w:sz w:val="19"/>
+        </w:rPr>
+        <w:t xml:space="preserve"> (Líder Técnico)</w:t>
+        <w:br/>
+      </w:r>
+      <w:r>
+        <w:rPr>
+          <w:rFonts w:ascii="Arial" w:hAnsi="Arial"/>
+          <w:color w:val="1E293B"/>
+          <w:sz w:val="21"/>
+        </w:rPr>
+        <w:t xml:space="preserve">• </w:t>
+      </w:r>
+      <w:r>
+        <w:rPr>
+          <w:rFonts w:ascii="Arial" w:hAnsi="Arial"/>
+          <w:b/>
+          <w:color w:val="0F172A"/>
+          <w:sz w:val="21"/>
+        </w:rPr>
+        <w:t xml:space="preserve">Fernando Alber Alfredo Romero Requejo </w:t>
       </w:r>
       <w:r>
         <w:rPr>
           <w:rFonts w:ascii="Arial" w:hAnsi="Arial"/>
           <w:color w:val="334155"/>
+          <w:sz w:val="21"/>
+        </w:rPr>
+        <w:t>– Código: U21216410</w:t>
+      </w:r>
+      <w:r>
+        <w:rPr>
+          <w:rFonts w:ascii="Arial" w:hAnsi="Arial"/>
         </w:rPr>
         <w:br/>
+      </w:r>
+      <w:r>
+        <w:rPr>
+          <w:rFonts w:ascii="Arial" w:hAnsi="Arial"/>
+          <w:color w:val="1E293B"/>
+          <w:sz w:val="21"/>
+        </w:rPr>
+        <w:t xml:space="preserve">• </w:t>
       </w:r>
       <w:r>
         <w:rPr>
           <w:rFonts w:ascii="Arial" w:hAnsi="Arial"/>
           <w:b/>
-          <w:color w:val="003366"/>
-        </w:rPr>
-        <w:t>Curso Integrador I: Sistemas Software (Sección 57524)</w:t>
+          <w:color w:val="0F172A"/>
+          <w:sz w:val="21"/>
+        </w:rPr>
+        <w:t xml:space="preserve">Joel Leonardo Olaya Vivas </w:t>
+      </w:r>
+      <w:r>
+        <w:rPr>
+          <w:rFonts w:ascii="Arial" w:hAnsi="Arial"/>
+          <w:color w:val="334155"/>
+          <w:sz w:val="21"/>
+        </w:rPr>
+        <w:t>– Código: U21221688</w:t>
+      </w:r>
+      <w:r>
+        <w:rPr>
+          <w:rFonts w:ascii="Arial" w:hAnsi="Arial"/>
+        </w:rPr>
+        <w:br/>
+      </w:r>
+      <w:r>
+        <w:rPr>
+          <w:rFonts w:ascii="Arial" w:hAnsi="Arial"/>
+          <w:color w:val="1E293B"/>
+          <w:sz w:val="21"/>
+        </w:rPr>
+        <w:t xml:space="preserve">• </w:t>
       </w:r>
       <w:r>
         <w:rPr>
           <w:rFonts w:ascii="Arial" w:hAnsi="Arial"/>
           <w:b/>
-          <w:color w:val="003366"/>
-        </w:rPr>
-        <w:br/>
+          <w:color w:val="0F172A"/>
+          <w:sz w:val="21"/>
+        </w:rPr>
+        <w:t xml:space="preserve">Luis Tapia Ignacio </w:t>
       </w:r>
       <w:r>
         <w:rPr>
           <w:rFonts w:ascii="Arial" w:hAnsi="Arial"/>
           <w:color w:val="334155"/>
+          <w:sz w:val="21"/>
+        </w:rPr>
+        <w:t>– Código: U25239074</w:t>
+      </w:r>
+      <w:r>
+        <w:rPr>
+          <w:rFonts w:ascii="Arial" w:hAnsi="Arial"/>
+        </w:rPr>
+        <w:br/>
+      </w:r>
+      <w:r>
+        <w:br/>
+      </w:r>
+      <w:r>
+        <w:rPr>
+          <w:rFonts w:ascii="Arial" w:hAnsi="Arial"/>
+          <w:color w:val="475569"/>
+          <w:sz w:val="21"/>
+        </w:rPr>
+        <w:t>Facultad de Ingeniería de Sistemas e Informática, Universidad Tecnológica del Perú</w:t>
+        <w:br/>
+      </w:r>
+      <w:r>
+        <w:rPr>
+          <w:rFonts w:ascii="Arial" w:hAnsi="Arial"/>
+          <w:b/>
+          <w:color w:val="0F172A"/>
+          <w:sz w:val="21"/>
+        </w:rPr>
+        <w:t>Curso Integrador I: Sistemas Software (Sección 57524)</w:t>
+        <w:br/>
+      </w:r>
+      <w:r>
+        <w:rPr>
+          <w:rFonts w:ascii="Arial" w:hAnsi="Arial"/>
+          <w:color w:val="475569"/>
+          <w:sz w:val="21"/>
         </w:rPr>
         <w:t>Docente: Ing. Yony Zamata Condori</w:t>
+        <w:br/>
       </w:r>
       <w:r>
         <w:rPr>
           <w:rFonts w:ascii="Arial" w:hAnsi="Arial"/>
-          <w:color w:val="334155"/>
-        </w:rPr>
-        <w:br/>
-      </w:r>
-      <w:r>
-        <w:rPr>
-          <w:rFonts w:ascii="Arial" w:hAnsi="Arial"/>
-          <w:color w:val="64748B"/>
-        </w:rPr>
-        <w:t>Lima, Perú — Septiembre de 2026</w:t>
+          <w:color w:val="475569"/>
+          <w:sz w:val="21"/>
+        </w:rPr>
+        <w:t>Lima, Perú • Septiembre de 2026</w:t>
       </w:r>
     </w:p>
     <w:p>
@@ -6330,10 +6438,7 @@
           </w:tcPr>
           <w:p>
             <w:r>
-              <w:rPr>
-                <w:sz w:val="17"/>
-              </w:rPr>
-              <w:t>Ing. Yony Zamata Condori (Docente UTP) | Frank Emiliano Vargas Huamán (Estudiante UTP)</w:t>
+              <w:t>Ing. Yony Zamata Condori (Docente UTP) | Frank Emiliano Vargas Huamán (Líder - U23243651), Fernando Alber Alfredo Romero Requejo (U21216410), Joel Leonardo Olaya Vivas (U21221688), Luis Tapia Ignacio (U25239074)</w:t>
             </w:r>
           </w:p>
         </w:tc>

</xml_diff>

<commit_message>
docs: delimitar titulo sintetico del prototipo en informe docx, pdf, markdown y readme
</commit_message>
<xml_diff>
--- a/01_DOCUMENTACION_TECNICA/INFORME_ACADEMICO_APF1_COMPLETO.docx
+++ b/01_DOCUMENTACION_TECNICA/INFORME_ACADEMICO_APF1_COMPLETO.docx
@@ -14,20 +14,10 @@
         <w:rPr>
           <w:rFonts w:ascii="Arial" w:hAnsi="Arial"/>
           <w:b/>
-          <w:color w:val="003366"/>
+          <w:color w:val="0F172A"/>
           <w:sz w:val="32"/>
         </w:rPr>
-        <w:t>Sistema Integral de Gestión de Incidentes Regulatorios para Pagos Digitales (SIGIR - BCRP):</w:t>
-      </w:r>
-      <w:r>
-        <w:rPr>
-          <w:rFonts w:ascii="Arial" w:hAnsi="Arial"/>
-          <w:b/>
-          <w:color w:val="003366"/>
-          <w:sz w:val="32"/>
-        </w:rPr>
-        <w:br/>
-        <w:t>Especificación Arquitectónica, Modelado de Negocio y Cimientos de Software para la Supervisión del Ecosistema Financiero Peruano</w:t>
+        <w:t>SIGIR - BCRP: Sistema de Gestión de Incidentes Regulatorios para Pagos Digitales</w:t>
       </w:r>
     </w:p>
     <w:p>
@@ -38,11 +28,10 @@
       <w:r>
         <w:rPr>
           <w:rFonts w:ascii="Arial" w:hAnsi="Arial"/>
-          <w:i/>
           <w:color w:val="475569"/>
-          <w:sz w:val="23"/>
-        </w:rPr>
-        <w:t>Avance de Proyecto Final 1 (APF1) – Etapa 01: Supervisión de Billeteras Móviles, Switches Interoperables y Autenticación Centralizada</w:t>
+          <w:sz w:val="24"/>
+        </w:rPr>
+        <w:t>Prototipo de Telemetría y Supervisión Continua de Pagos Interoperables (APF1)</w:t>
       </w:r>
     </w:p>
     <w:p/>

</xml_diff>

<commit_message>
docs: auditar tablas y textos en informe academico docx y pdf
</commit_message>
<xml_diff>
--- a/01_DOCUMENTACION_TECNICA/INFORME_ACADEMICO_APF1_COMPLETO.docx
+++ b/01_DOCUMENTACION_TECNICA/INFORME_ACADEMICO_APF1_COMPLETO.docx
@@ -6383,10 +6383,7 @@
           </w:tcPr>
           <w:p>
             <w:r>
-              <w:rPr>
-                <w:sz w:val="17"/>
-              </w:rPr>
-              <w:t>Sistema Integral de Gestión de Incidentes Regulatorios (SIGIR - BCRP) | PRJ-2026-SIGIR-57524</w:t>
+              <w:t>SIGIR - BCRP: Sistema de Gestión de Incidentes Regulatorios para Pagos Digitales | PRJ-2026-SIGIR-57524</w:t>
             </w:r>
           </w:p>
         </w:tc>
@@ -6405,12 +6402,7 @@
           </w:tcPr>
           <w:p>
             <w:r>
-              <w:rPr>
-                <w:b/>
-                <w:color w:val="FFFFFF"/>
-                <w:sz w:val="17"/>
-              </w:rPr>
-              <w:t>Patrocinador (PO) / Líder Técnico</w:t>
+              <w:t>Patrocinador (PO) / Equipo del Proyecto</w:t>
             </w:r>
           </w:p>
         </w:tc>
@@ -7999,17 +7991,8 @@
             </w:tcMar>
           </w:tcPr>
           <w:p>
-            <w:pPr>
-              <w:spacing w:before="60" w:after="60"/>
-            </w:pPr>
-            <w:r>
-              <w:rPr>
-                <w:rFonts w:ascii="Arial" w:hAnsi="Arial"/>
-                <w:b/>
-                <w:color w:val="FFFFFF"/>
-                <w:sz w:val="19"/>
-              </w:rPr>
-              <w:t>Lead Dev (Frank V.)</w:t>
+            <w:r>
+              <w:t>Equipo Dev (Frank V. &amp; Equipo)</w:t>
             </w:r>
           </w:p>
         </w:tc>

</xml_diff>